<commit_message>
Enterprise: Fact Sheet korrigiert, Vorlagen für Betriebsrat und DSFA
- Fact Sheet 1.3: A1 verwies als Nachweis auf Tests PR-01/PR-02 einer
  QA-Suite, die nicht Teil der Lieferung ist, und der Kalenderabgleich ist
  noch nicht gebaut. Status jetzt "Teilweise umgesetzt" (Identitätsdaten
  belegt, Termininhalte offen), A1 in "Offene Punkte vor Produktivstart".
- docs/Betriebsvereinbarung-Entwurf.md: Vorlage nach § 87 Abs. 1 Nr. 6
  BetrVG mit Fundstellen im Code (Zweckbindung, keine Leistungskontrolle,
  Teilnahme nur durch die Beschäftigten selbst, Löschung, Kontrollrechte).
- docs/DSFA-Entwurf.md: Vorlage nach Art. 35 DSGVO mit Risiken,
  Maßnahmen und Fundstellen, offene Punkte ausdrücklich benannt.

Co-Authored-By: Claude Opus 5.5 <noreply@anthropic.com>
Claude-Session: https://claude.ai/code/session_01CJATKr46Wb8LoazB7nxXUJ
</commit_message>
<xml_diff>
--- a/3-enterprise/CalenSync-Enterprise-Security-Fact-Sheet.docx
+++ b/3-enterprise/CalenSync-Enterprise-Security-Fact-Sheet.docx
@@ -55,7 +55,7 @@
           <w:sz w:val="18"/>
           <w:szCs w:val="18"/>
         </w:rPr>
-        <w:t xml:space="preserve">Version 1.2 · Stand 01.10.2026 · Gültig für den dedizierten Mandanten-Stack (Terraform-Konfiguration „calensync-enterprise“)</w:t>
+        <w:t xml:space="preserve">Version 1.3 · Stand 01.10.2026 · Gültig für den dedizierten Mandanten-Stack (Terraform-Konfiguration „calensync-enterprise“)</w:t>
       </w:r>
     </w:p>
     <w:p>
@@ -486,15 +486,14 @@
                 <w:sz w:val="18"/>
                 <w:szCs w:val="18"/>
               </w:rPr>
-              <w:t xml:space="preserve">Nicht persistent:</w:t>
-            </w:r>
-            <w:r>
-              <w:rPr>
-                <w:rFonts w:ascii="Arial" w:cs="Arial" w:eastAsia="Arial" w:hAnsi="Arial"/>
-                <w:sz w:val="18"/>
-                <w:szCs w:val="18"/>
-              </w:rPr>
-              <w:t xml:space="preserve"> Termininhalte (Titel, Beschreibung, Ort, Teilnehmer). Sie werden nur flüchtig im Arbeitsspeicher verarbeitet, um Filter auszuwerten. Im Modus „Als beschäftigt markieren“ erreichen sie den Zielkalender nie.</w:t>
+              <w:t xml:space="preserve">Nicht persistent: Termininhalte (Titel, Beschreibung, Ort, Teilnehmer). Sie werden nur flüchtig im Arbeitsspeicher verarbeitet, um Filter auszuwerten. Im Modus „Als beschäftigt markieren“ erreichen sie den Zielkalender nie. Hinweis: Der Kalenderabgleich selbst ist noch nicht fertiggestellt; diese Zusage gilt für die Auslieferung und wird vor Produktivstart durch Tests nachgewiesen.</w:t>
+            </w:r>
+            <w:r>
+              <w:rPr>
+                <w:rFonts w:ascii="Arial" w:cs="Arial" w:eastAsia="Arial" w:hAnsi="Arial"/>
+                <w:sz w:val="18"/>
+                <w:szCs w:val="18"/>
+              </w:rPr>
             </w:r>
           </w:p>
           <w:p>
@@ -540,7 +539,7 @@
                 <w:sz w:val="18"/>
                 <w:szCs w:val="18"/>
               </w:rPr>
-              <w:t xml:space="preserve">Umgesetzt</w:t>
+              <w:t xml:space="preserve">Teilweise umgesetzt</w:t>
             </w:r>
           </w:p>
         </w:tc>
@@ -571,7 +570,7 @@
                 <w:sz w:val="16"/>
                 <w:szCs w:val="16"/>
               </w:rPr>
-              <w:t xml:space="preserve">SCIM-Code: Attribut-Whitelist, Test „speichert nur minimale Attribute“; QA-Suite: Kanarienvogel-Tests PR-01/PR-02 (kein Inhalt in DB, Logs, Ziel-Payload)</w:t>
+              <w:t xml:space="preserve">Umgesetzt für Identitätsdaten: SCIM-Attribut-Whitelist, Test „speichert nur minimale Attribute“ (scim/test/scim.test.ts). Offen für Termininhalte: Nachweis durch Tests „kein Termininhalt in Datenbank, Logs und Ziel-Payload“ nach Fertigstellung des Kalenderabgleichs.</w:t>
             </w:r>
           </w:p>
         </w:tc>
@@ -8430,6 +8429,24 @@
           <w:szCs w:val="20"/>
         </w:rPr>
         <w:t xml:space="preserve">H1 ISMS nach ISO/IEC 27001: Projektplan und Zieltermin an den Auftraggeber übergeben.</w:t>
+      </w:r>
+    </w:p>
+    <w:p>
+      <w:pPr>
+        <w:pStyle w:val="ListParagraph"/>
+        <w:numPr>
+          <w:ilvl w:val="0"/>
+          <w:numId w:val="2"/>
+        </w:numPr>
+        <w:spacing w:after="60"/>
+      </w:pPr>
+      <w:r>
+        <w:rPr>
+          <w:rFonts w:ascii="Arial" w:cs="Arial" w:eastAsia="Arial" w:hAnsi="Arial"/>
+          <w:sz w:val="20"/>
+          <w:szCs w:val="20"/>
+        </w:rPr>
+        <w:t xml:space="preserve">A1 Kalenderabgleich fertigstellen und nachweisen, dass Termininhalte weder in Datenbank noch Logs gespeichert werden und im Modus „Als beschäftigt markieren“ nicht im Zielkalender ankommen.</w:t>
       </w:r>
     </w:p>
     <w:p>

</xml_diff>

<commit_message>
Enterprise-Doku und Fact Sheet auf den geprüften Stand gebracht
- DEPLOYMENT.md, START-HIER.md, ENTERPRISE-ARCHITEKTUR.md: Schema aus
  SQL-Migrationen, Lockfiles vorhanden, echte Pakete geprüft, Testzahlen.
- Fact Sheet H3: 143 Tests im ausgelieferten Code statt "89 Tests" mit
  Verweis auf eine externe QA-Suite, die nicht Teil der Lieferung ist.

Co-Authored-By: Claude Opus 5.5 <noreply@anthropic.com>
Claude-Session: https://claude.ai/code/session_01CJATKr46Wb8LoazB7nxXUJ
</commit_message>
<xml_diff>
--- a/3-enterprise/CalenSync-Enterprise-Security-Fact-Sheet.docx
+++ b/3-enterprise/CalenSync-Enterprise-Security-Fact-Sheet.docx
@@ -8170,7 +8170,7 @@
                 <w:sz w:val="18"/>
                 <w:szCs w:val="18"/>
               </w:rPr>
-              <w:t xml:space="preserve">Automatisierte Testsuite mit 89 Tests (u. a. Mandantentrennung, DSGVO-Löschung auf Datenbankebene, Chaos- und Lasttests). Ein CI-Gatekeeper verhindert Test-Code in Produktions-Builds. Container-Images werden per Digest gepinnt. Schwachstellenscan der Images und Abhängigkeiten im CI ist geplant.</w:t>
+              <w:t xml:space="preserve">Automatisierte Testsuite im ausgelieferten Code mit 143 Tests (app 21, core 71, scim 47, Frontend-Client 4), davon 12 gegen echtes PostgreSQL 16; u. a. Mandantentrennung, Kill-Switch-Transaktion, Sperr-Reihenfolge, SCIM-Transport-Härtung, Webhook-Validierung. Migrationen werden auf einer leeren Datenbank und idempotent geprüft. Container-Images werden per Digest gepinnt. Schwachstellenscan der Images und Abhängigkeiten im CI ist geplant.</w:t>
             </w:r>
           </w:p>
         </w:tc>
@@ -8234,7 +8234,7 @@
                 <w:sz w:val="16"/>
                 <w:szCs w:val="16"/>
               </w:rPr>
-              <w:t xml:space="preserve">calensync-qa (CI-Workflow ci-chaos.yml)</w:t>
+              <w:t xml:space="preserve">3-enterprise: app/test, core/test, scim/test, frontend/; Chaos- und Lasttests der separaten QA-Suite sind nicht Teil der Lieferung</w:t>
             </w:r>
           </w:p>
         </w:tc>

</xml_diff>

<commit_message>
Dashboard: Abgleich beenden; Fact Sheet 1.4, DSFA und Betriebsvereinbarung zum Abgleich
- enterprise.js: Knopf "Beenden" mit Bestätigung (DELETE), Hinweis während
  Zieltermine entfernt werden, cleanup_*-Fehler auf Deutsch. Playwright
  10/10 neu, 44/44 bestehend; dashboard.css nur um eine Klasse ergänzt.
- Fact Sheet 1.4: A1 umgesetzt mit Kanarienvogel-Tests, Abnahme mit
  echtem Mandanten offen; H3 188 Tests.
- DSFA/Betriebsvereinbarung: Ziele, Freigabeliste, Bereinigung beim
  Beenden und Austritt, offene Abnahme mit echtem Mandanten.

Co-Authored-By: Claude Opus 5.5 <noreply@anthropic.com>
Claude-Session: https://claude.ai/code/session_01CJATKr46Wb8LoazB7nxXUJ
</commit_message>
<xml_diff>
--- a/3-enterprise/CalenSync-Enterprise-Security-Fact-Sheet.docx
+++ b/3-enterprise/CalenSync-Enterprise-Security-Fact-Sheet.docx
@@ -55,7 +55,7 @@
           <w:sz w:val="18"/>
           <w:szCs w:val="18"/>
         </w:rPr>
-        <w:t xml:space="preserve">Version 1.3 · Stand 01.10.2026 · Gültig für den dedizierten Mandanten-Stack (Terraform-Konfiguration „calensync-enterprise“)</w:t>
+        <w:t xml:space="preserve">Version 1.4 · Stand 01.10.2026 · Gültig für den dedizierten Mandanten-Stack (Terraform-Konfiguration „calensync-enterprise“)</w:t>
       </w:r>
     </w:p>
     <w:p>
@@ -486,7 +486,7 @@
                 <w:sz w:val="18"/>
                 <w:szCs w:val="18"/>
               </w:rPr>
-              <w:t xml:space="preserve">Nicht persistent: Termininhalte (Titel, Beschreibung, Ort, Teilnehmer). Sie werden nur flüchtig im Arbeitsspeicher verarbeitet, um Filter auszuwerten. Im Modus „Als beschäftigt markieren“ erreichen sie den Zielkalender nie. Hinweis: Der Kalenderabgleich selbst ist noch nicht fertiggestellt; diese Zusage gilt für die Auslieferung und wird vor Produktivstart durch Tests nachgewiesen.</w:t>
+              <w:t xml:space="preserve">Nicht persistent: Termininhalte (Titel, Beschreibung, Ort, Teilnehmer). Sie werden nur flüchtig im Arbeitsspeicher verarbeitet, um Filter auszuwerten. Im Modus „Als beschäftigt markieren“ erreichen sie den Zielkalender nie; im Modus „vollständig“ werden nur Titel und Ort übertragen, nie Beschreibung oder Teilnehmende. Ziele: zweites Microsoft-365-Postfach derselben Person (auch in einem verbundenen Tochter-Mandanten), vom Administrator freigegebene Team-Kalender oder die CalenSync-Buchungsseite. Beim Beenden, Deaktivieren oder Löschen entfernt CalenSync alle selbst angelegten Zieltermine.</w:t>
             </w:r>
             <w:r>
               <w:rPr>
@@ -539,7 +539,7 @@
                 <w:sz w:val="18"/>
                 <w:szCs w:val="18"/>
               </w:rPr>
-              <w:t xml:space="preserve">Teilweise umgesetzt</w:t>
+              <w:t xml:space="preserve">Umgesetzt (Abnahme mit echtem Mandanten offen)</w:t>
             </w:r>
           </w:p>
         </w:tc>
@@ -570,7 +570,7 @@
                 <w:sz w:val="16"/>
                 <w:szCs w:val="16"/>
               </w:rPr>
-              <w:t xml:space="preserve">Umgesetzt für Identitätsdaten: SCIM-Attribut-Whitelist, Test „speichert nur minimale Attribute“ (scim/test/scim.test.ts). Offen für Termininhalte: Nachweis durch Tests „kein Termininhalt in Datenbank, Logs und Ziel-Payload“ nach Fertigstellung des Kalenderabgleichs.</w:t>
+              <w:t xml:space="preserve">Identitätsdaten: SCIM-Attribut-Whitelist, Test „speichert nur minimale Attribute“ (scim/test/scim.test.ts). Termininhalte: Kanarienvogel-Tests in core/test/syncWorker.test.ts (busy und full: kein Inhalt in Repo, Queue, Log, Alarm und Ziel-Payload) und app/test/sync.pg.test.ts (Ende-zu-Ende auf PostgreSQL: kein Inhalt in einer Tabelle oder Logzeile). Bisher gegen eine Graph-Nachbildung geprüft, Abnahme mit echtem Microsoft-365-Testmandanten offen.</w:t>
             </w:r>
           </w:p>
         </w:tc>
@@ -8170,7 +8170,7 @@
                 <w:sz w:val="18"/>
                 <w:szCs w:val="18"/>
               </w:rPr>
-              <w:t xml:space="preserve">Automatisierte Testsuite im ausgelieferten Code mit 143 Tests (app 21, core 71, scim 47, Frontend-Client 4), davon 12 gegen echtes PostgreSQL 16; u. a. Mandantentrennung, Kill-Switch-Transaktion, Sperr-Reihenfolge, SCIM-Transport-Härtung, Webhook-Validierung. Migrationen werden auf einer leeren Datenbank und idempotent geprüft. Container-Images werden per Digest gepinnt. Schwachstellenscan der Images und Abhängigkeiten im CI ist geplant.</w:t>
+              <w:t xml:space="preserve">Automatisierte Testsuite im ausgelieferten Code mit 188 Tests (app 40, core 95, scim 48, Frontend-Client 5), davon 21 gegen echtes PostgreSQL 16; u. a. Mandantentrennung, Kill-Switch-Transaktion, Sperr-Reihenfolge, SCIM-Transport-Härtung, Webhook-Validierung, Zielfreigabe (Allowlist) in API und Worker, Kanarienvogel-Tests für Termininhalte, Bereinigung der Zieltermine. Migrationen werden auf einer leeren Datenbank und idempotent geprüft. Container-Images werden per Digest gepinnt. Schwachstellenscan der Images und Abhängigkeiten im CI ist geplant.</w:t>
             </w:r>
           </w:p>
         </w:tc>
@@ -8446,7 +8446,7 @@
           <w:sz w:val="20"/>
           <w:szCs w:val="20"/>
         </w:rPr>
-        <w:t xml:space="preserve">A1 Kalenderabgleich fertigstellen und nachweisen, dass Termininhalte weder in Datenbank noch Logs gespeichert werden und im Modus „Als beschäftigt markieren“ nicht im Zielkalender ankommen.</w:t>
+        <w:t xml:space="preserve">A1 Kalenderabgleich und Bereinigung der Zieltermine mit einem echten Microsoft-365-Testmandanten abnehmen (bisher gegen eine Graph-Nachbildung getestet); Google-Ziele sind noch nicht unterstützt.</w:t>
       </w:r>
     </w:p>
     <w:p>

</xml_diff>

<commit_message>
Enterprise-Doku: Fact Sheet 1.5 (Google-Ziel in D4, 220 Tests, terraform validate), Terraform-Stand in START-HIER/DEPLOYMENT/ARCHITEKTUR
Co-Authored-By: Claude Opus 5.5 <noreply@anthropic.com>
Claude-Session: https://claude.ai/code/session_01CJATKr46Wb8LoazB7nxXUJ
</commit_message>
<xml_diff>
--- a/3-enterprise/CalenSync-Enterprise-Security-Fact-Sheet.docx
+++ b/3-enterprise/CalenSync-Enterprise-Security-Fact-Sheet.docx
@@ -55,7 +55,7 @@
           <w:sz w:val="18"/>
           <w:szCs w:val="18"/>
         </w:rPr>
-        <w:t xml:space="preserve">Version 1.4 · Stand 01.10.2026 · Gültig für den dedizierten Mandanten-Stack (Terraform-Konfiguration „calensync-enterprise“)</w:t>
+        <w:t xml:space="preserve">Version 1.5 · Stand 01.10.2026 · Gültig für den dedizierten Mandanten-Stack (Terraform-Konfiguration „calensync-enterprise“)</w:t>
       </w:r>
     </w:p>
     <w:p>
@@ -3474,7 +3474,7 @@
                 <w:sz w:val="18"/>
                 <w:szCs w:val="18"/>
               </w:rPr>
-              <w:t xml:space="preserve">Nein. Google bietet keine plattformseitige Begrenzung domänenweiter Delegation auf eine Nutzergruppe. CalenSync begrenzt den Zugriff dort softwareseitig (nur SCIM-provisionierte, aktive Mitglieder der Freigabegruppe; minimaler Scope calendar.events; schlüssellose Workload Identity Federation). Alternativ: OAuth-App nur für eine Organisationseinheit als vertrauenswürdig freigeben.</w:t>
+              <w:t xml:space="preserve">Nein. Google bietet keine plattformseitige Begrenzung domänenweiter Delegation auf eine Nutzergruppe. Google Workspace ist bei CalenSync nur Ziel (zweites Konto), nie Quelle. CalenSync begrenzt den Zugriff softwareseitig: Scope calendar.events nur für Google-Konten in freigegebenen Domains, die nachweislich einem per SCIM provisionierten, aktiven Mitglied der Freigabegruppe gehören (Prüfung bei Anlage und alle 24 Stunden: Google-Mitarbeiter-ID gleich Entra-employeeId); nach einem Widerruf werden nur noch die eigenen Termine gelöscht. Der zweite Scope admin.directory.user.readonly wird ausschließlich über ein eigenes Directory-Konto mit der Rolle „Nutzer: Lesen“ genutzt. Kein Dienstkonto-Schlüssel: Signatur über IAM signJwt mit Workload Identity Federation aus der ECS-Task-Rolle. Abgewiesene Zugriffe lösen einen Betriebsalarm aus. Alternativ: OAuth-App nur für eine Organisationseinheit als vertrauenswürdig freigeben.</w:t>
             </w:r>
           </w:p>
         </w:tc>
@@ -8170,7 +8170,7 @@
                 <w:sz w:val="18"/>
                 <w:szCs w:val="18"/>
               </w:rPr>
-              <w:t xml:space="preserve">Automatisierte Testsuite im ausgelieferten Code mit 199 Tests (app 46, core 100, scim 48, Frontend-Client 5), davon 23 gegen echtes PostgreSQL 16; u. a. Mandantentrennung, Kill-Switch-Transaktion, Sperr-Reihenfolge, SCIM-Transport-Härtung, Webhook-Validierung, Zielfreigabe (Allowlist) und Identitätsprüfung in API und Worker, Kanarienvogel-Tests für Termininhalte, Bereinigung der Zieltermine inkl. Historie. Migrationen werden auf einer leeren Datenbank und idempotent geprüft. Container-Images werden per Digest gepinnt. Schwachstellenscan der Images und Abhängigkeiten im CI ist geplant.</w:t>
+              <w:t xml:space="preserve">Automatisierte Testsuite im ausgelieferten Code mit 220 Tests (app 51, core 116, scim 48, Frontend-Client 5), davon 24 gegen echtes PostgreSQL 16; u. a. Mandantentrennung, Kill-Switch-Transaktion, Sperr-Reihenfolge, SCIM-Transport-Härtung, Webhook-Validierung, Zielfreigabe (Allowlist) und Identitätsprüfung in API und Worker für Microsoft 365 und Google Workspace, Kanarienvogel-Tests für Termininhalte, Bereinigung der Zieltermine inkl. Historie. Migrationen werden auf einer leeren Datenbank und idempotent geprüft; die Terraform-Konfiguration besteht terraform validate (AWS-Provider 6.67). Abhängigkeiten ohne bekannte Schwachstellen (npm audit). Container-Images werden per Digest gepinnt. Schwachstellenscan der Images im CI ist geplant.</w:t>
             </w:r>
           </w:p>
         </w:tc>

</xml_diff>